<commit_message>
Refresh final report, slides, demo evidence and submission packaging
Prepared with Codex assistance. Validate the extracted source build and both test targets; refresh current renderer captures and benchmarks. Preserve unconfirmed team contributions, TA verification and submission status as pending.
</commit_message>
<xml_diff>
--- a/output/Baikonur_Report.docx
+++ b/output/Baikonur_Report.docx
@@ -255,7 +255,7 @@
           <w:rFonts w:ascii="Times New Roman" w:hAnsi="Times New Roman" w:cs="Times New Roman"/>
           <w:lang w:val="en-US"/>
         </w:rPr>
-        <w:t xml:space="preserve"> </w:t>
+        <w:t xml:space="preserve"> To be confirmed</w:t>
       </w:r>
     </w:p>
     <w:p>
@@ -580,6 +580,21 @@
       <w:r>
         <w:rPr>
           <w:rFonts w:ascii="Times New Roman" w:hAnsi="Times New Roman"/>
+          <w:b w:val="0"/>
+          <w:color w:val="000000"/>
+          <w:sz w:val="24"/>
+        </w:rPr>
+        <w:t>Appendix B Kazakhstan terrain .......................................... 20</w:t>
+      </w:r>
+    </w:p>
+    <w:p>
+      <w:pPr>
+        <w:keepNext w:val="0"/>
+        <w:spacing w:after="160" w:line="278" w:lineRule="auto"/>
+      </w:pPr>
+      <w:r>
+        <w:rPr>
+          <w:rFonts w:ascii="Times New Roman" w:hAnsi="Times New Roman"/>
           <w:b/>
           <w:color w:val="000000"/>
           <w:sz w:val="24"/>
@@ -944,7 +959,7 @@
           <w:color w:val="000000"/>
           <w:sz w:val="24"/>
         </w:rPr>
-        <w:t>Bridson, Hourihan and Nordenstam [10] derive procedural velocity fields using curl noise, enabling incompressible turbulent motion and boundary-aware behavior without a full simulation. This offers a closer extension path for the current application than an adaptive fluid solver. A future version could replace the simple outward smoke velocity with a curl-noise field. The current release does not label its sinusoidal ground pattern or random particle velocities as curl noise.</w:t>
+        <w:t>Bridson, Hourihan and Nordenstam [10] derive procedural velocity fields using curl noise, enabling incompressible turbulent motion and boundary-aware behavior without a full simulation. This offers a closer extension path for the current application than an adaptive fluid solver. A future version could replace the simple outward smoke velocity with a curl-noise field. The current release does not label its value-noise ground pattern or random particle velocities as curl noise.</w:t>
       </w:r>
     </w:p>
     <w:p>
@@ -1054,7 +1069,7 @@
           <w:color w:val="000000"/>
           <w:sz w:val="24"/>
         </w:rPr>
-        <w:t>Perlin [4] improves the construction of procedural noise, while Lagae and colleagues [15] compare noise families, filtering and their uses in graphics. These works explain why continuity and frequency content matter when procedural patterns are sampled. The implementation uses an original low-frequency trigonometric steppe pattern and a deterministic random concrete image. Neither is described as Perlin noise. More sophisticated noise would improve the natural appearance of the terrain and smoke.</w:t>
+        <w:t>Perlin [4] improves the construction of procedural noise, while Lagae and colleagues [15] compare noise families, filtering and their uses in graphics. These works explain why continuity and frequency content matter when procedural patterns are sampled. The implementation uses an original interpolated value-noise steppe pattern and a deterministic random concrete image. Neither is described as Perlin noise. More sophisticated noise would improve the natural appearance of the terrain and smoke.</w:t>
       </w:r>
     </w:p>
     <w:p>
@@ -1308,7 +1323,7 @@
                 <w:b w:val="0"/>
                 <w:sz w:val="24"/>
               </w:rPr>
-              <w:t>Steppe, pad, flame trench, gantry, rocket, four boosters, buildings, tanks, radome, roads and lights.</w:t>
+              <w:t>Kazakhstan terrain, pad, gantry, rocket, four boosters, hangar, tanks, radome, service vehicles, railway and steppe scenery.</w:t>
             </w:r>
           </w:p>
         </w:tc>
@@ -1776,7 +1791,7 @@
                 <w:b w:val="0"/>
                 <w:sz w:val="24"/>
               </w:rPr>
-              <w:t>Static scene and rocket hierarchy; particle lifetime updates and instanced billboard passes.</w:t>
+              <w:t>Terrain and scenery, rocket hierarchy, particle lifetime updates and instanced billboard passes.</w:t>
             </w:r>
           </w:p>
         </w:tc>
@@ -2287,7 +2302,7 @@
           <w:color w:val="000000"/>
           <w:sz w:val="24"/>
         </w:rPr>
-        <w:t>Figure 1 shows the shared primitive meshes assembled into distinct scene objects. The rocket transform parents the body, nose, bands and boosters. The orange gantry bracing and turquoise vehicle panels establish a consistent palette.</w:t>
+        <w:t>Figure 1 shows the rocket and gantry beside the ribbed hangar, fuel farm, pipework, vehicles and railway. Shared primitive meshes form these objects. Kazakhstan terrain uses a projected Natural Earth boundary with concave triangulation and solid side walls (Appendix B).</w:t>
       </w:r>
     </w:p>
     <w:p>
@@ -2899,7 +2914,7 @@
           <w:color w:val="000000"/>
           <w:sz w:val="24"/>
         </w:rPr>
-        <w:t>CTest runs a standalone simulation test executable. It checks grounded idle state, ignition timing, pause, ascent, separation continuity, outward booster motion, equivalent progression at 30 and 60 updates per second, reset, rejection of premature separation, automatic separation, bounded atmosphere values and finite booster transforms. The automated suite passes. Rendering tests compile every shader and check OpenGL errors after each frame. No independent student user study has been conducted.</w:t>
+        <w:t>CTest passes both mission_invariants and kazakhstan_terrain. Mission checks cover ignition, pause/reset, ascent, separation continuity and equivalent progression at different update rates. Terrain checks cover valid indices, outward winding, nondegenerate faces, triangulation area and launch-site containment. Rendering checks compile shaders and inspect OpenGL errors. No independent student user study has been conducted.</w:t>
       </w:r>
     </w:p>
     <w:p>
@@ -3066,7 +3081,7 @@
                 <w:b w:val="0"/>
                 <w:sz w:val="24"/>
               </w:rPr>
-              <w:t>1068.3</w:t>
+              <w:t>504.4</w:t>
             </w:r>
           </w:p>
         </w:tc>
@@ -3084,7 +3099,7 @@
                 <w:b w:val="0"/>
                 <w:sz w:val="24"/>
               </w:rPr>
-              <w:t>1.32</w:t>
+              <w:t>3.93</w:t>
             </w:r>
           </w:p>
         </w:tc>
@@ -3143,7 +3158,7 @@
                 <w:b w:val="0"/>
                 <w:sz w:val="24"/>
               </w:rPr>
-              <w:t>699.0</w:t>
+              <w:t>477.6</w:t>
             </w:r>
           </w:p>
         </w:tc>
@@ -3161,7 +3176,7 @@
                 <w:b w:val="0"/>
                 <w:sz w:val="24"/>
               </w:rPr>
-              <w:t>2.44</w:t>
+              <w:t>2.73</w:t>
             </w:r>
           </w:p>
         </w:tc>
@@ -3179,7 +3194,7 @@
                 <w:b w:val="0"/>
                 <w:sz w:val="24"/>
               </w:rPr>
-              <w:t>1398</w:t>
+              <w:t>1399</w:t>
             </w:r>
           </w:p>
         </w:tc>
@@ -3220,7 +3235,7 @@
                 <w:b w:val="0"/>
                 <w:sz w:val="24"/>
               </w:rPr>
-              <w:t>929.9</w:t>
+              <w:t>586.2</w:t>
             </w:r>
           </w:p>
         </w:tc>
@@ -3238,7 +3253,7 @@
                 <w:b w:val="0"/>
                 <w:sz w:val="24"/>
               </w:rPr>
-              <w:t>1.76</w:t>
+              <w:t>2.14</w:t>
             </w:r>
           </w:p>
         </w:tc>
@@ -3256,7 +3271,7 @@
                 <w:b w:val="0"/>
                 <w:sz w:val="24"/>
               </w:rPr>
-              <w:t>1399</w:t>
+              <w:t>1398</w:t>
             </w:r>
           </w:p>
         </w:tc>
@@ -3288,7 +3303,7 @@
           <w:color w:val="000000"/>
           <w:sz w:val="24"/>
         </w:rPr>
-        <w:t>These are local frame-loop throughput measurements, including CPU work and buffer swaps. They are not GPU-only timings and do not establish performance on the TA machine. Occasional frame outliers remain; these averages do not guarantee every frame meets the target. Raw CSV data and exact commands accompany the project. The edited demonstration uses 3840 by 2160 renderer captures, downsampled to 1920 by 1080 with a visible FPS counter and no playback speed change.</w:t>
+        <w:t>These are local frame-loop throughput measurements, including CPU work and buffer swaps. They are not GPU-only timings and do not establish performance on the TA machine. Occasional frame outliers remain; these averages do not guarantee every frame meets the target. Raw CSV data and exact commands accompany the project. The refreshed demonstration records the current scene at native 1920 by 1080 with a visible FPS counter and no playback speed change.</w:t>
       </w:r>
     </w:p>
     <w:p>
@@ -3398,7 +3413,7 @@
           <w:color w:val="000000"/>
           <w:sz w:val="24"/>
         </w:rPr>
-        <w:t>The animation follows a visual trajectory rather than a force-based rocket model. The site uses repeated primitives, the terrain is a large flat surface, and the sky is an artistic gradient. Smoke does not collide with the gantry or cast volumetric shadows. The current blend ordering uses particle-center distance, which is an approximation for overlapping billboards. At extreme altitude or camera distance, the finite terrain and long projection range can expose visual limits.</w:t>
+        <w:t>The animation follows a visual trajectory rather than a force-based rocket model. The site uses repeated primitives, the terrain follows a simplified national boundary with a flat top, and the sky is an artistic gradient. Smoke does not collide with the gantry or cast volumetric shadows. The current blend ordering uses particle-center distance, which is an approximation for overlapping billboards. At extreme altitude or camera distance, the finite terrain and long projection range can expose visual limits.</w:t>
       </w:r>
     </w:p>
     <w:p>
@@ -3458,7 +3473,7 @@
           <w:color w:val="000000"/>
           <w:sz w:val="24"/>
         </w:rPr>
-        <w:t>The strongest software improvements would be a more general scene-node representation, finer resource-error cleanup, and platform CI for Windows and Linux in addition to the tested Mac build. A structured user evaluation could measure whether observers can identify the major launch events and operate the controls without assistance. Each improvement should retain the project's central teaching purpose: making the graphics pipeline explainable.</w:t>
+        <w:t>The strongest software improvements would be a more general scene-node representation, finer resource-error cleanup, and desktop rendering checks on Windows and Linux. A GitHub Actions matrix is configured for builds and numerical tests on all three platforms; its first hosted run is pending. A structured user evaluation could measure whether observers can identify the major launch events and operate the controls without assistance. Each improvement should retain the project's central teaching purpose: making the graphics pipeline explainable.</w:t>
       </w:r>
     </w:p>
     <w:p>
@@ -3898,7 +3913,7 @@
           <w:color w:val="000000"/>
           <w:sz w:val="24"/>
         </w:rPr>
-        <w:t>AI-assisted revisions made during validation included fixing the GLAD definition scope, correcting the emission ratio at high frame rates, moving the controls help to avoid overlap, separating fixed-resolution recording from window size, correcting framebuffer sample compatibility, and locking the scripted demo against unrelated input. These changes were followed by the automated and rendering checks reported in Section 6.</w:t>
+        <w:t>AI-assisted revisions made during validation included fixing the GLAD definition scope, correcting the emission ratio at high frame rates, moving the controls help to avoid overlap, separating fixed-resolution recording from window size, correcting framebuffer sample compatibility, and locking the scripted demo against unrelated input. Later revisions added Kazakhstan terrain, scenery, terrain tests, refreshed evidence and a platform build workflow. These changes were followed by the automated and rendering checks reported in Section 6.</w:t>
       </w:r>
     </w:p>
     <w:p>
@@ -3943,7 +3958,7 @@
           <w:color w:val="000000"/>
           <w:sz w:val="24"/>
         </w:rPr>
-        <w:t>Geometry, visual textures, shader effects and screenshots originate in the project. The report preserves the university logo from the supplied template. Scholarly papers informed comparisons and design reasoning; their advanced algorithms are not presented as implemented features. The source package retains library license files. The video contains real-time rendered application output with in-application captions and telemetry, encoded without speed alteration.</w:t>
+        <w:t>Procedural geometry, textures, shaders and screenshots originate in the project. The terrain boundary derives from Natural Earth v5.1.2 public-domain map data, credited in Appendix B and CREDITS.md. The report preserves the university logo from the supplied template. Scholarly papers informed comparisons and design reasoning; their advanced algorithms are not presented as implemented features. The source package retains library license files. The video contains real-time rendered application output with in-application captions and telemetry, encoded without speed alteration.</w:t>
       </w:r>
     </w:p>
     <w:p>
@@ -4359,7 +4374,152 @@
           <w:color w:val="000000"/>
           <w:sz w:val="24"/>
         </w:rPr>
-        <w:t>The defense and submission dates remain to be confirmed. The team must verify topic registration, provide its hosted repository, add the TA, maintain genuine member commits, tag the actual submission revision v1.0, and upload the report PDF, slide deck and demo. The submission deadline is three days before defense at 23:59 Asia/Almaty. The local package cannot establish account-based submission or individual oral understanding.</w:t>
+        <w:t>The defense and submission dates remain to be confirmed. The team must verify topic registration, confirm TA access to github.com/aqinaq/baiqonyr, maintain genuine member commits, tag the actual submission revision v1.0, and upload the report PDF, slide deck and demo. The submission deadline is three days before defense at 23:59 Asia/Almaty. The local package cannot establish account-based submission or individual oral understanding.</w:t>
+      </w:r>
+    </w:p>
+    <w:p>
+      <w:r>
+        <w:br w:type="page"/>
+      </w:r>
+    </w:p>
+    <w:p>
+      <w:pPr>
+        <w:keepNext/>
+        <w:spacing w:after="160" w:line="278" w:lineRule="auto"/>
+      </w:pPr>
+      <w:r>
+        <w:rPr>
+          <w:rFonts w:ascii="Times New Roman" w:hAnsi="Times New Roman"/>
+          <w:b/>
+          <w:color w:val="000000"/>
+          <w:sz w:val="24"/>
+        </w:rPr>
+        <w:t>Appendix B Kazakhstan terrain</w:t>
+      </w:r>
+    </w:p>
+    <w:p>
+      <w:pPr>
+        <w:keepNext/>
+        <w:spacing w:after="160" w:line="278" w:lineRule="auto"/>
+        <w:jc w:val="center"/>
+      </w:pPr>
+      <w:r>
+        <w:rPr>
+          <w:rFonts w:ascii="Times New Roman" w:hAnsi="Times New Roman"/>
+          <w:b w:val="0"/>
+          <w:color w:val="000000"/>
+          <w:sz w:val="24"/>
+        </w:rPr>
+      </w:r>
+      <w:r>
+        <w:drawing>
+          <wp:inline xmlns:a="http://schemas.openxmlformats.org/drawingml/2006/main" xmlns:pic="http://schemas.openxmlformats.org/drawingml/2006/picture">
+            <wp:extent cx="5806440" cy="3266122"/>
+            <wp:docPr id="11" name="Picture 11"/>
+            <wp:cNvGraphicFramePr>
+              <a:graphicFrameLocks noChangeAspect="1"/>
+            </wp:cNvGraphicFramePr>
+            <a:graphic>
+              <a:graphicData uri="http://schemas.openxmlformats.org/drawingml/2006/picture">
+                <pic:pic>
+                  <pic:nvPicPr>
+                    <pic:cNvPr id="0" name="kazakhstan-map.png"/>
+                    <pic:cNvPicPr/>
+                  </pic:nvPicPr>
+                  <pic:blipFill>
+                    <a:blip r:embed="rId20"/>
+                    <a:stretch>
+                      <a:fillRect/>
+                    </a:stretch>
+                  </pic:blipFill>
+                  <pic:spPr>
+                    <a:xfrm>
+                      <a:off x="0" y="0"/>
+                      <a:ext cx="5806440" cy="3266122"/>
+                    </a:xfrm>
+                    <a:prstGeom prst="rect"/>
+                  </pic:spPr>
+                </pic:pic>
+              </a:graphicData>
+            </a:graphic>
+          </wp:inline>
+        </w:drawing>
+      </w:r>
+    </w:p>
+    <w:p>
+      <w:pPr>
+        <w:keepNext w:val="0"/>
+        <w:spacing w:after="160" w:line="278" w:lineRule="auto"/>
+        <w:jc w:val="center"/>
+      </w:pPr>
+      <w:r>
+        <w:rPr>
+          <w:rFonts w:ascii="Times New Roman" w:hAnsi="Times New Roman"/>
+          <w:b w:val="0"/>
+          <w:color w:val="000000"/>
+          <w:sz w:val="24"/>
+        </w:rPr>
+        <w:t>Fig. 7 Kazakhstan outline viewed from high altitude</w:t>
+      </w:r>
+    </w:p>
+    <w:p>
+      <w:pPr>
+        <w:keepNext w:val="0"/>
+        <w:spacing w:after="160" w:line="278" w:lineRule="auto"/>
+      </w:pPr>
+      <w:r>
+        <w:rPr>
+          <w:rFonts w:ascii="Times New Roman" w:hAnsi="Times New Roman"/>
+          <w:b w:val="0"/>
+          <w:color w:val="000000"/>
+          <w:sz w:val="24"/>
+        </w:rPr>
+        <w:t>The terrain uses the Kazakhstan boundary from Natural Earth v5.1.2 at 1:110m scale. An equirectangular projection at 48 degrees north maps east to +X and north to -Z. The approximate Baikonur launch area at 63.34 degrees east and 45.92 degrees north becomes the scene origin. The country is scaled to 10,000 scene units wide.</w:t>
+      </w:r>
+    </w:p>
+    <w:p>
+      <w:pPr>
+        <w:keepNext w:val="0"/>
+        <w:spacing w:after="160" w:line="278" w:lineRule="auto"/>
+      </w:pPr>
+      <w:r>
+        <w:rPr>
+          <w:rFonts w:ascii="Times New Roman" w:hAnsi="Times New Roman"/>
+          <w:b w:val="0"/>
+          <w:color w:val="000000"/>
+          <w:sz w:val="24"/>
+        </w:rPr>
+        <w:t>Ear clipping triangulates the concave outline without filling across its indentations. Reversed bottom triangles and side quads close the mesh into a shallow solid. Tests compare triangle area with polygon area, inspect winding and verify that the launch complex lies inside the boundary. The baked header and original GeoJSON are bundled, so rebuilding does not download map data.</w:t>
+      </w:r>
+    </w:p>
+    <w:p>
+      <w:pPr>
+        <w:keepNext w:val="0"/>
+        <w:spacing w:after="160" w:line="278" w:lineRule="auto"/>
+      </w:pPr>
+      <w:r>
+        <w:rPr>
+          <w:rFonts w:ascii="Times New Roman" w:hAnsi="Times New Roman"/>
+          <w:b w:val="0"/>
+          <w:color w:val="000000"/>
+          <w:sz w:val="24"/>
+        </w:rPr>
+        <w:t>The launch-site details include a ribbed hangar, pipework, vehicles, railway, cables, scrub and rocks. They are stylized procedural scenery. The country outline is a display map with a flat top, not a measured elevation model or a reconstruction of the real launch facility.</w:t>
+      </w:r>
+    </w:p>
+    <w:p>
+      <w:pPr>
+        <w:keepNext w:val="0"/>
+        <w:spacing w:after="160" w:line="278" w:lineRule="auto"/>
+      </w:pPr>
+      <w:r>
+        <w:rPr>
+          <w:rFonts w:ascii="Times New Roman" w:hAnsi="Times New Roman"/>
+          <w:b w:val="0"/>
+          <w:color w:val="000000"/>
+          <w:sz w:val="24"/>
+        </w:rPr>
+        <w:t>Map source and license: Natural Earth contributors, Admin 0 Countries, v5.1.2, public domain. https://github.com/nvkelso/natural-earth-vector/tree/v5.1.2/geojson and https://www.naturalearthdata.com/about/terms-of-use/ . See CREDITS.md for the exact source file.</w:t>
       </w:r>
     </w:p>
     <w:sectPr>

</xml_diff>